<commit_message>
Cleanup: fix scripts, remove redundant files, update README
- Fix CSV metrics parsing (tab delimiter for multi-word fields)
- Fix check-setup.sh to auto-source .env for API key detection
- Fix demo-readiness.sh: IoT pod counting by name prefix, remove hanging smoke check
- Fix one-command-ready.sh: prevent unnecessary K3s restart
- Fix IoT device count in main.py (add env-sensor, street-lighting prefixes)
- Remove cost estimation from LLM dashboard tab
- Remove 5 redundant scripts (demo.sh, demo-walkthrough.sh, build-images.sh, check-system.sh, k3s-dynamic-ip.sh)
- Archive 6 legacy attack-simulations/ scripts to docs/_archive/
- Refactor demo-day.sh to use attack-iot-pipeline.sh instead of deleted scripts
- Update README with accurate line counts, scripts table, 45 endpoints
- Rename simulator -> device/emulator across docs and manifests
- Clean up stray files
</commit_message>
<xml_diff>
--- a/CAPSTONE_2_REPORT.docx
+++ b/CAPSTONE_2_REPORT.docx
@@ -2,32 +2,6 @@
 <file path=word/document.xml><?xml version="1.0" encoding="utf-8"?>
 <w:document xmlns:w="http://schemas.openxmlformats.org/wordprocessingml/2006/main" xmlns:m="http://schemas.openxmlformats.org/officeDocument/2006/math" xmlns:r="http://schemas.openxmlformats.org/officeDocument/2006/relationships" xmlns:o="urn:schemas-microsoft-com:office:office" xmlns:v="urn:schemas-microsoft-com:vml" xmlns:w10="urn:schemas-microsoft-com:office:word" xmlns:a="http://schemas.openxmlformats.org/drawingml/2006/main" xmlns:pic="http://schemas.openxmlformats.org/drawingml/2006/picture" xmlns:wp="http://schemas.openxmlformats.org/drawingml/2006/wordprocessingDrawing">
   <w:body>
-    <w:sdt>
-      <w:sdtPr>
-        <w:docPartObj>
-          <w:docPartGallery w:val="Table of Contents"/>
-          <w:docPartUnique/>
-        </w:docPartObj>
-      </w:sdtPr>
-      <w:sdtContent>
-        <w:p>
-          <w:pPr>
-            <w:pStyle w:val="TOCHeading"/>
-          </w:pPr>
-          <w:r>
-            <w:t xml:space="preserve">Table of Contents</w:t>
-          </w:r>
-        </w:p>
-        <w:p>
-          <w:r>
-            <w:fldChar w:fldCharType="begin" w:dirty="true"/>
-            <w:instrText xml:space="preserve">TOC \o "1-3" \h \z \u</w:instrText>
-            <w:fldChar w:fldCharType="separate"/>
-            <w:fldChar w:fldCharType="end"/>
-          </w:r>
-        </w:p>
-      </w:sdtContent>
-    </w:sdt>
     <w:bookmarkStart w:id="139" w:name="X224a8cc15075358e3ba8484dcfbd3d935964dd5"/>
     <w:p>
       <w:pPr>
@@ -26592,7 +26566,6 @@
     <w:link w:val="VerbatimChar"/>
     <w:pPr>
       <w:wordWrap w:val="off"/>
-      <w:shd w:val="clear" w:fill="f8f8f8"/>
     </w:pPr>
   </w:style>
   <w:style w:type="character" w:customStyle="1" w:styleId="KeywordTok">
@@ -26600,96 +26573,85 @@
     <w:basedOn w:val="VerbatimChar"/>
     <w:rPr>
       <w:b/>
-      <w:color w:val="204a87"/>
-      <w:shd w:val="clear" w:fill="f8f8f8"/>
+      <w:color w:val="007020"/>
     </w:rPr>
   </w:style>
   <w:style w:type="character" w:customStyle="1" w:styleId="DataTypeTok">
     <w:name w:val="DataTypeTok"/>
     <w:basedOn w:val="VerbatimChar"/>
     <w:rPr>
-      <w:color w:val="204a87"/>
-      <w:shd w:val="clear" w:fill="f8f8f8"/>
+      <w:color w:val="902000"/>
     </w:rPr>
   </w:style>
   <w:style w:type="character" w:customStyle="1" w:styleId="DecValTok">
     <w:name w:val="DecValTok"/>
     <w:basedOn w:val="VerbatimChar"/>
     <w:rPr>
-      <w:color w:val="0000cf"/>
-      <w:shd w:val="clear" w:fill="f8f8f8"/>
+      <w:color w:val="40a070"/>
     </w:rPr>
   </w:style>
   <w:style w:type="character" w:customStyle="1" w:styleId="BaseNTok">
     <w:name w:val="BaseNTok"/>
     <w:basedOn w:val="VerbatimChar"/>
     <w:rPr>
-      <w:color w:val="0000cf"/>
-      <w:shd w:val="clear" w:fill="f8f8f8"/>
+      <w:color w:val="40a070"/>
     </w:rPr>
   </w:style>
   <w:style w:type="character" w:customStyle="1" w:styleId="FloatTok">
     <w:name w:val="FloatTok"/>
     <w:basedOn w:val="VerbatimChar"/>
     <w:rPr>
-      <w:color w:val="0000cf"/>
-      <w:shd w:val="clear" w:fill="f8f8f8"/>
+      <w:color w:val="40a070"/>
     </w:rPr>
   </w:style>
   <w:style w:type="character" w:customStyle="1" w:styleId="ConstantTok">
     <w:name w:val="ConstantTok"/>
     <w:basedOn w:val="VerbatimChar"/>
     <w:rPr>
-      <w:color w:val="8f5902"/>
-      <w:shd w:val="clear" w:fill="f8f8f8"/>
+      <w:color w:val="880000"/>
     </w:rPr>
   </w:style>
   <w:style w:type="character" w:customStyle="1" w:styleId="CharTok">
     <w:name w:val="CharTok"/>
     <w:basedOn w:val="VerbatimChar"/>
     <w:rPr>
-      <w:color w:val="4e9a06"/>
-      <w:shd w:val="clear" w:fill="f8f8f8"/>
+      <w:color w:val="4070a0"/>
     </w:rPr>
   </w:style>
   <w:style w:type="character" w:customStyle="1" w:styleId="SpecialCharTok">
     <w:name w:val="SpecialCharTok"/>
     <w:basedOn w:val="VerbatimChar"/>
     <w:rPr>
-      <w:b/>
-      <w:color w:val="ce5c00"/>
-      <w:shd w:val="clear" w:fill="f8f8f8"/>
+      <w:color w:val="4070a0"/>
     </w:rPr>
   </w:style>
   <w:style w:type="character" w:customStyle="1" w:styleId="StringTok">
     <w:name w:val="StringTok"/>
     <w:basedOn w:val="VerbatimChar"/>
     <w:rPr>
-      <w:color w:val="4e9a06"/>
-      <w:shd w:val="clear" w:fill="f8f8f8"/>
+      <w:color w:val="4070a0"/>
     </w:rPr>
   </w:style>
   <w:style w:type="character" w:customStyle="1" w:styleId="VerbatimStringTok">
     <w:name w:val="VerbatimStringTok"/>
     <w:basedOn w:val="VerbatimChar"/>
     <w:rPr>
-      <w:color w:val="4e9a06"/>
-      <w:shd w:val="clear" w:fill="f8f8f8"/>
+      <w:color w:val="4070a0"/>
     </w:rPr>
   </w:style>
   <w:style w:type="character" w:customStyle="1" w:styleId="SpecialStringTok">
     <w:name w:val="SpecialStringTok"/>
     <w:basedOn w:val="VerbatimChar"/>
     <w:rPr>
-      <w:color w:val="4e9a06"/>
-      <w:shd w:val="clear" w:fill="f8f8f8"/>
+      <w:color w:val="bb6688"/>
     </w:rPr>
   </w:style>
   <w:style w:type="character" w:customStyle="1" w:styleId="ImportTok">
     <w:name w:val="ImportTok"/>
     <w:basedOn w:val="VerbatimChar"/>
     <w:rPr>
-      <w:shd w:val="clear" w:fill="f8f8f8"/>
+      <w:b/>
+      <w:color w:val="008000"/>
     </w:rPr>
   </w:style>
   <w:style w:type="character" w:customStyle="1" w:styleId="CommentTok">
@@ -26697,18 +26659,15 @@
     <w:basedOn w:val="VerbatimChar"/>
     <w:rPr>
       <w:i/>
-      <w:color w:val="8f5902"/>
-      <w:shd w:val="clear" w:fill="f8f8f8"/>
+      <w:color w:val="60a0b0"/>
     </w:rPr>
   </w:style>
   <w:style w:type="character" w:customStyle="1" w:styleId="DocumentationTok">
     <w:name w:val="DocumentationTok"/>
     <w:basedOn w:val="VerbatimChar"/>
     <w:rPr>
-      <w:b/>
       <w:i/>
-      <w:color w:val="8f5902"/>
-      <w:shd w:val="clear" w:fill="f8f8f8"/>
+      <w:color w:val="ba2121"/>
     </w:rPr>
   </w:style>
   <w:style w:type="character" w:customStyle="1" w:styleId="AnnotationTok">
@@ -26717,8 +26676,7 @@
     <w:rPr>
       <w:b/>
       <w:i/>
-      <w:color w:val="8f5902"/>
-      <w:shd w:val="clear" w:fill="f8f8f8"/>
+      <w:color w:val="60a0b0"/>
     </w:rPr>
   </w:style>
   <w:style w:type="character" w:customStyle="1" w:styleId="CommentVarTok">
@@ -26727,33 +26685,28 @@
     <w:rPr>
       <w:b/>
       <w:i/>
-      <w:color w:val="8f5902"/>
-      <w:shd w:val="clear" w:fill="f8f8f8"/>
+      <w:color w:val="60a0b0"/>
     </w:rPr>
   </w:style>
   <w:style w:type="character" w:customStyle="1" w:styleId="OtherTok">
     <w:name w:val="OtherTok"/>
     <w:basedOn w:val="VerbatimChar"/>
     <w:rPr>
-      <w:color w:val="8f5902"/>
-      <w:shd w:val="clear" w:fill="f8f8f8"/>
+      <w:color w:val="007020"/>
     </w:rPr>
   </w:style>
   <w:style w:type="character" w:customStyle="1" w:styleId="FunctionTok">
     <w:name w:val="FunctionTok"/>
     <w:basedOn w:val="VerbatimChar"/>
     <w:rPr>
-      <w:b/>
-      <w:color w:val="204a87"/>
-      <w:shd w:val="clear" w:fill="f8f8f8"/>
+      <w:color w:val="06287e"/>
     </w:rPr>
   </w:style>
   <w:style w:type="character" w:customStyle="1" w:styleId="VariableTok">
     <w:name w:val="VariableTok"/>
     <w:basedOn w:val="VerbatimChar"/>
     <w:rPr>
-      <w:color w:val="000000"/>
-      <w:shd w:val="clear" w:fill="f8f8f8"/>
+      <w:color w:val="19177c"/>
     </w:rPr>
   </w:style>
   <w:style w:type="character" w:customStyle="1" w:styleId="ControlFlowTok">
@@ -26761,56 +26714,46 @@
     <w:basedOn w:val="VerbatimChar"/>
     <w:rPr>
       <w:b/>
-      <w:color w:val="204a87"/>
-      <w:shd w:val="clear" w:fill="f8f8f8"/>
+      <w:color w:val="007020"/>
     </w:rPr>
   </w:style>
   <w:style w:type="character" w:customStyle="1" w:styleId="OperatorTok">
     <w:name w:val="OperatorTok"/>
     <w:basedOn w:val="VerbatimChar"/>
     <w:rPr>
-      <w:b/>
-      <w:color w:val="ce5c00"/>
-      <w:shd w:val="clear" w:fill="f8f8f8"/>
+      <w:color w:val="666666"/>
     </w:rPr>
   </w:style>
   <w:style w:type="character" w:customStyle="1" w:styleId="BuiltInTok">
     <w:name w:val="BuiltInTok"/>
     <w:basedOn w:val="VerbatimChar"/>
     <w:rPr>
-      <w:shd w:val="clear" w:fill="f8f8f8"/>
+      <w:color w:val="008000"/>
     </w:rPr>
   </w:style>
   <w:style w:type="character" w:customStyle="1" w:styleId="ExtensionTok">
     <w:name w:val="ExtensionTok"/>
     <w:basedOn w:val="VerbatimChar"/>
-    <w:rPr>
-      <w:shd w:val="clear" w:fill="f8f8f8"/>
-    </w:rPr>
+    <w:rPr/>
   </w:style>
   <w:style w:type="character" w:customStyle="1" w:styleId="PreprocessorTok">
     <w:name w:val="PreprocessorTok"/>
     <w:basedOn w:val="VerbatimChar"/>
     <w:rPr>
-      <w:i/>
-      <w:color w:val="8f5902"/>
-      <w:shd w:val="clear" w:fill="f8f8f8"/>
+      <w:color w:val="bc7a00"/>
     </w:rPr>
   </w:style>
   <w:style w:type="character" w:customStyle="1" w:styleId="AttributeTok">
     <w:name w:val="AttributeTok"/>
     <w:basedOn w:val="VerbatimChar"/>
     <w:rPr>
-      <w:color w:val="204a87"/>
-      <w:shd w:val="clear" w:fill="f8f8f8"/>
+      <w:color w:val="7d9029"/>
     </w:rPr>
   </w:style>
   <w:style w:type="character" w:customStyle="1" w:styleId="RegionMarkerTok">
     <w:name w:val="RegionMarkerTok"/>
     <w:basedOn w:val="VerbatimChar"/>
-    <w:rPr>
-      <w:shd w:val="clear" w:fill="f8f8f8"/>
-    </w:rPr>
+    <w:rPr/>
   </w:style>
   <w:style w:type="character" w:customStyle="1" w:styleId="InformationTok">
     <w:name w:val="InformationTok"/>
@@ -26818,8 +26761,7 @@
     <w:rPr>
       <w:b/>
       <w:i/>
-      <w:color w:val="8f5902"/>
-      <w:shd w:val="clear" w:fill="f8f8f8"/>
+      <w:color w:val="60a0b0"/>
     </w:rPr>
   </w:style>
   <w:style w:type="character" w:customStyle="1" w:styleId="WarningTok">
@@ -26828,16 +26770,15 @@
     <w:rPr>
       <w:b/>
       <w:i/>
-      <w:color w:val="8f5902"/>
-      <w:shd w:val="clear" w:fill="f8f8f8"/>
+      <w:color w:val="60a0b0"/>
     </w:rPr>
   </w:style>
   <w:style w:type="character" w:customStyle="1" w:styleId="AlertTok">
     <w:name w:val="AlertTok"/>
     <w:basedOn w:val="VerbatimChar"/>
     <w:rPr>
-      <w:color w:val="ef2929"/>
-      <w:shd w:val="clear" w:fill="f8f8f8"/>
+      <w:b/>
+      <w:color w:val="ff0000"/>
     </w:rPr>
   </w:style>
   <w:style w:type="character" w:customStyle="1" w:styleId="ErrorTok">
@@ -26845,16 +26786,13 @@
     <w:basedOn w:val="VerbatimChar"/>
     <w:rPr>
       <w:b/>
-      <w:color w:val="a40000"/>
-      <w:shd w:val="clear" w:fill="f8f8f8"/>
+      <w:color w:val="ff0000"/>
     </w:rPr>
   </w:style>
   <w:style w:type="character" w:customStyle="1" w:styleId="NormalTok">
     <w:name w:val="NormalTok"/>
     <w:basedOn w:val="VerbatimChar"/>
-    <w:rPr>
-      <w:shd w:val="clear" w:fill="f8f8f8"/>
-    </w:rPr>
+    <w:rPr/>
   </w:style>
 </w:styles>
 </file>

</xml_diff>